<commit_message>
docs: STD and topic documents record the 440/440 test run
Co-Authored-By: Claude Opus 5.5 <noreply@anthropic.com>
</commit_message>
<xml_diff>
--- a/docs/storage/TA9-Storage.docx
+++ b/docs/storage/TA9-Storage.docx
@@ -12753,22 +12753,7 @@
         <w:rPr>
           <w:rFonts w:ascii="Calibri" w:cs="Calibri" w:eastAsia="Calibri" w:hAnsi="Calibri"/>
         </w:rPr>
-        <w:t xml:space="preserve">, Testcontainers). All tests listed here passed in the latest full run (404 / 404), except </w:t>
-      </w:r>
-      <w:r>
-        <w:rPr>
-          <w:rFonts w:ascii="Consolas" w:cs="Consolas" w:eastAsia="Consolas" w:hAnsi="Consolas"/>
-          <w:color w:val="5B2C6F"/>
-          <w:sz w:val="19"/>
-          <w:szCs w:val="19"/>
-        </w:rPr>
-        <w:t xml:space="preserve">MongoUnavailableTests</w:t>
-      </w:r>
-      <w:r>
-        <w:rPr>
-          <w:rFonts w:ascii="Calibri" w:cs="Calibri" w:eastAsia="Calibri" w:hAnsi="Calibri"/>
-        </w:rPr>
-        <w:t xml:space="preserve"> (JS-143..145), added afterwards; re-run pending.</w:t>
+        <w:t xml:space="preserve">, Testcontainers). All tests listed here passed in the latest full run (440 / 440, 2026-10-27).</w:t>
       </w:r>
     </w:p>
     <w:p>

</xml_diff>